<commit_message>
Nr. 1: Trompetenstimmen liegen nach B transponiert vor
Die Partitur notiert Trompeten in D, die Stimmen sind aber bereits
transponiert geliefert. Damit ist es keine Notations- oder
Druckfrage mehr, sondern allein eine Balancefrage: ab wann spielen
Trompeten und Pauken mit. Entsprechend im Probenheft fuer den 09.10.,
in der Entscheidungsliste, im Ausblick auf den 27.11. und im
Stueckblatt korrigiert.

Co-Authored-By: Claude Opus 5 <noreply@anthropic.com>
Claude-Session: https://claude.ai/code/session_01GftfN2ZbR4hJMi8K4sLu7a
</commit_message>
<xml_diff>
--- a/probenplanung/02_Probentage/Orchesterprobe_2026-10-09.docx
+++ b/probenplanung/02_Probentage/Orchesterprobe_2026-10-09.docx
@@ -3034,7 +3034,7 @@
           <w:sz w:val="18"/>
           <w:szCs w:val="18"/>
         </w:rPr>
-        <w:t xml:space="preserve">Mozart, Adagio, 4/4, D-Dur, 46 Takte. Orchesterbearbeitung ohne Chorsystem: 2 Flöten · 2 Oboen · 2 Klarinetten in A · 2 Fagotte · 2 Hörner · 2 Trompeten in D · Pauken · Streicher. 2017 mit 110 Mitwirkenden gemacht — ohne Bläser.</w:t>
+        <w:t xml:space="preserve">Mozart, Adagio, 4/4, D-Dur, 46 Takte. Orchesterbearbeitung ohne Chorsystem: 2 Flöten · 2 Oboen · 2 Klarinetten in A · 2 Fagotte · 2 Hörner · 2 Trompeten in D · Pauken · Streicher. Die Trompetenstimmen sind bereits nach B transponiert geliefert — die Spieler lesen ihre gewohnte Stimme. 2017 mit 110 Mitwirkenden gemacht — ohne Bläser.</w:t>
       </w:r>
     </w:p>
     <w:p>
@@ -3101,7 +3101,7 @@
           <w:sz w:val="16"/>
           <w:szCs w:val="16"/>
         </w:rPr>
-        <w:t xml:space="preserve">Mozart schrieb Streicher und Orgel · hier volles Holz, Hörner, Trompeten in D und Pauken · dazu im Mai 220 Stimmen</w:t>
+        <w:t xml:space="preserve">Mozart schrieb Streicher und Orgel · hier volles Holz, Hörner, Trompeten (Stimmen nach B transponiert) und Pauken · dazu im Mai 220 Stimmen</w:t>
       </w:r>
     </w:p>
     <w:p>
@@ -3217,21 +3217,21 @@
           <w:sz w:val="15"/>
           <w:szCs w:val="15"/>
         </w:rPr>
-        <w:t xml:space="preserve">Trp in D / Pauken   </w:t>
-      </w:r>
-      <w:r>
-        <w:rPr>
-          <w:rFonts w:ascii="Calibri" w:cs="Calibri" w:eastAsia="Calibri" w:hAnsi="Calibri"/>
-          <w:b w:val="false"/>
-          <w:bCs w:val="false"/>
-          <w:i w:val="false"/>
-          <w:iCs w:val="false"/>
-          <w:caps w:val="false"/>
-          <w:color w:val="1A1D23"/>
-          <w:sz w:val="19"/>
-          <w:szCs w:val="19"/>
-        </w:rPr>
-        <w:t xml:space="preserve">Trompeten in D und Pauken sind in einem Mozart-Adagio Fremdkörper. Die Entscheidung gehört heute getroffen, weil danach die Stimmen gedruckt werden.</w:t>
+        <w:t xml:space="preserve">Trompeten / Pauken   </w:t>
+      </w:r>
+      <w:r>
+        <w:rPr>
+          <w:rFonts w:ascii="Calibri" w:cs="Calibri" w:eastAsia="Calibri" w:hAnsi="Calibri"/>
+          <w:b w:val="false"/>
+          <w:bCs w:val="false"/>
+          <w:i w:val="false"/>
+          <w:iCs w:val="false"/>
+          <w:caps w:val="false"/>
+          <w:color w:val="1A1D23"/>
+          <w:sz w:val="19"/>
+          <w:szCs w:val="19"/>
+        </w:rPr>
+        <w:t xml:space="preserve">Trompeten und Pauken sind in einem Mozart-Adagio Fremdkörper. Das ist keine Notationsfrage mehr — die Stimmen liegen nach B transponiert vor —, sondern allein eine Frage der Balance: Spielen sie von Anfang an mit, oder erst, wenn sich das Stück steigert?</w:t>
       </w:r>
     </w:p>
     <w:p>
@@ -3265,7 +3265,7 @@
           <w:sz w:val="17"/>
           <w:szCs w:val="17"/>
         </w:rPr>
-        <w:t xml:space="preserve">Vorschlag: erst ab der Steigerung, nicht ab Takt 1. Beide Varianten spielen, wählen, eintragen.</w:t>
+        <w:t xml:space="preserve">Vorschlag: erst ab der Steigerung, nicht ab Takt 1. Beide Varianten spielen, wählen — und die Entscheidung heute in die vorhandenen Stimmen eintragen lassen.</w:t>
       </w:r>
     </w:p>
     <w:p>
@@ -3418,7 +3418,7 @@
           <w:sz w:val="19"/>
           <w:szCs w:val="19"/>
         </w:rPr>
-        <w:t xml:space="preserve">Nr. 1 — Trompeten in D und Pauken: ab Takt 1 oder erst ab der Steigerung?</w:t>
+        <w:t xml:space="preserve">Nr. 1 — Trompeten und Pauken: ab Takt 1 oder erst ab der Steigerung?</w:t>
       </w:r>
     </w:p>
     <w:p>
@@ -3438,7 +3438,7 @@
           <w:sz w:val="17"/>
           <w:szCs w:val="17"/>
         </w:rPr>
-        <w:t xml:space="preserve">Danach werden die Stimmen gedruckt.</w:t>
+        <w:t xml:space="preserve">Die Stimmen sind nach B transponiert schon geliefert — die Entscheidung muss nur noch hinein.</w:t>
       </w:r>
     </w:p>
     <w:p>
@@ -4048,7 +4048,7 @@
           <w:sz w:val="19"/>
           <w:szCs w:val="19"/>
         </w:rPr>
-        <w:t xml:space="preserve">Nr. 9 Solokette · Nr. 1 Trompeten in D · Nr. 10 Marcato-Block und Tonartwechsel. </w:t>
+        <w:t xml:space="preserve">Nr. 9 Solokette · Nr. 1 Trompeten und Pauken: Einsatzpunkt und Balance · Nr. 10 Marcato-Block und Tonartwechsel. </w:t>
       </w:r>
       <w:r>
         <w:rPr>

</xml_diff>

<commit_message>
Seitenzahlen in allen Unterlagen, plus Werkzeuge dafuer
Aus der Probenpraxis: eine einzelne Seite ohne Nummer ist wertlos,
und Neusortieren kostet Zeit am Pult.

- _Werkzeuge/paginate.py stempelt in ein fertiges PDF eine Fusszeile
  (links Kurztitel, rechts "Seite n / N").
- _Werkzeuge/docx_fusszeile.py haengt einem fertigen .docx eine
  Fusszeile mit echten PAGE/NUMPAGES-Feldern an, die Word selbst
  aktualisiert. Beide Skripte sind idempotent.
- Der Word-Generator der Orchesterprobe erzeugt die Fusszeile direkt.
- Nachgeruestet: Probenmappe 12.09. (12 S.), Einsingen (7 S.),
  Orchesterprobe 09.10. (9 S.), je als PDF und Word.
- Arbeitsweise.md Punkt 7 haelt die Regel als Vorgabe fuer alle
  kuenftigen Unterlagen fest.

Co-Authored-By: Claude Opus 5 <noreply@anthropic.com>
Claude-Session: https://claude.ai/code/session_01GftfN2ZbR4hJMi8K4sLu7a
</commit_message>
<xml_diff>
--- a/probenplanung/02_Probentage/Orchesterprobe_2026-10-09.docx
+++ b/probenplanung/02_Probentage/Orchesterprobe_2026-10-09.docx
@@ -4339,6 +4339,7 @@
       </w:r>
     </w:p>
     <w:sectPr>
+      <w:footerReference w:type="default" r:id="rId6"/>
       <w:pgSz w:w="11906" w:h="16838" w:orient="portrait"/>
       <w:pgMar w:top="1134" w:right="1134" w:bottom="1134" w:left="1134" w:header="708" w:footer="708" w:gutter="0"/>
       <w:pgNumType/>
@@ -4383,6 +4384,51 @@
     </w:p>
   </w:endnote>
 </w:endnotes>
+</file>
+
+<file path=word/footer1.xml><?xml version="1.0" encoding="utf-8"?>
+<w:ftr xmlns:wpc="http://schemas.microsoft.com/office/word/2010/wordprocessingCanvas" xmlns:mc="http://schemas.openxmlformats.org/markup-compatibility/2006" xmlns:o="urn:schemas-microsoft-com:office:office" xmlns:r="http://schemas.openxmlformats.org/officeDocument/2006/relationships" xmlns:m="http://schemas.openxmlformats.org/officeDocument/2006/math" xmlns:v="urn:schemas-microsoft-com:vml" xmlns:wp14="http://schemas.microsoft.com/office/word/2010/wordprocessingDrawing" xmlns:wp="http://schemas.openxmlformats.org/drawingml/2006/wordprocessingDrawing" xmlns:w10="urn:schemas-microsoft-com:office:word" xmlns:w="http://schemas.openxmlformats.org/wordprocessingml/2006/main" xmlns:w14="http://schemas.microsoft.com/office/word/2010/wordml" xmlns:w15="http://schemas.microsoft.com/office/word/2012/wordml" xmlns:wpg="http://schemas.microsoft.com/office/word/2010/wordprocessingGroup" xmlns:wpi="http://schemas.microsoft.com/office/word/2010/wordprocessingInk" xmlns:wne="http://schemas.microsoft.com/office/word/2006/wordml" xmlns:wps="http://schemas.microsoft.com/office/word/2010/wordprocessingShape">
+  <w:p>
+    <w:pPr>
+      <w:tabs>
+        <w:tab w:val="right" w:pos="9638"/>
+      </w:tabs>
+    </w:pPr>
+    <w:r>
+      <w:rPr>
+        <w:rFonts w:ascii="Consolas" w:cs="Consolas" w:eastAsia="Consolas" w:hAnsi="Consolas"/>
+        <w:b w:val="false"/>
+        <w:bCs w:val="false"/>
+        <w:i w:val="false"/>
+        <w:iCs w:val="false"/>
+        <w:caps w:val="false"/>
+        <w:color w:val="7A8090"/>
+        <w:sz w:val="14"/>
+        <w:szCs w:val="14"/>
+      </w:rPr>
+      <w:t xml:space="preserve">Orchesterprobe 09.10.2026 · Pfingstkonzert 2027</w:t>
+    </w:r>
+    <w:r>
+      <w:rPr>
+        <w:rFonts w:ascii="Consolas" w:cs="Consolas" w:eastAsia="Consolas" w:hAnsi="Consolas"/>
+        <w:color w:val="7A8090"/>
+        <w:sz w:val="14"/>
+        <w:szCs w:val="14"/>
+      </w:rPr>
+      <w:t xml:space="preserve">	</w:t>
+      <w:t xml:space="preserve">Seite </w:t>
+      <w:fldChar w:fldCharType="begin"/>
+      <w:instrText xml:space="preserve">PAGE</w:instrText>
+      <w:fldChar w:fldCharType="separate"/>
+      <w:fldChar w:fldCharType="end"/>
+      <w:t xml:space="preserve"> / </w:t>
+      <w:fldChar w:fldCharType="begin"/>
+      <w:instrText xml:space="preserve">NUMPAGES</w:instrText>
+      <w:fldChar w:fldCharType="separate"/>
+      <w:fldChar w:fldCharType="end"/>
+    </w:r>
+  </w:p>
+</w:ftr>
 </file>
 
 <file path=word/footnotes.xml><?xml version="1.0" encoding="utf-8"?>

</xml_diff>